<commit_message>
Added error delete methods
</commit_message>
<xml_diff>
--- a/DOCS/customers/InstagramDMAtılanlar.docx
+++ b/DOCS/customers/InstagramDMAtılanlar.docx
@@ -2,17 +2,205 @@
 <file path=word/document.xml><?xml version="1.0" encoding="utf-8"?>
 <w:document xmlns:wpc="http://schemas.microsoft.com/office/word/2010/wordprocessingCanvas" xmlns:cx="http://schemas.microsoft.com/office/drawing/2014/chartex" xmlns:cx1="http://schemas.microsoft.com/office/drawing/2015/9/8/chartex" xmlns:cx2="http://schemas.microsoft.com/office/drawing/2015/10/21/chartex" xmlns:cx3="http://schemas.microsoft.com/office/drawing/2016/5/9/chartex" xmlns:cx4="http://schemas.microsoft.com/office/drawing/2016/5/10/chartex" xmlns:cx5="http://schemas.microsoft.com/office/drawing/2016/5/11/chartex" xmlns:cx6="http://schemas.microsoft.com/office/drawing/2016/5/12/chartex" xmlns:cx7="http://schemas.microsoft.com/office/drawing/2016/5/13/chartex" xmlns:cx8="http://schemas.microsoft.com/office/drawing/2016/5/14/chartex" xmlns:mc="http://schemas.openxmlformats.org/markup-compatibility/2006" xmlns:aink="http://schemas.microsoft.com/office/drawing/2016/ink" xmlns:am3d="http://schemas.microsoft.com/office/drawing/2017/model3d" xmlns:o="urn:schemas-microsoft-com:office:office" xmlns:oel="http://schemas.microsoft.com/office/2019/extlst" xmlns:r="http://schemas.openxmlformats.org/officeDocument/2006/relationships" xmlns:m="http://schemas.openxmlformats.org/officeDocument/2006/math" xmlns:v="urn:schemas-microsoft-com:vml" xmlns:wp14="http://schemas.microsoft.com/office/word/2010/wordprocessingDrawing" xmlns:wp="http://schemas.openxmlformats.org/drawingml/2006/wordprocessingDrawing" xmlns:w10="urn:schemas-microsoft-com:office:word" xmlns:w="http://schemas.openxmlformats.org/wordprocessingml/2006/main" xmlns:w14="http://schemas.microsoft.com/office/word/2010/wordml" xmlns:w15="http://schemas.microsoft.com/office/word/2012/wordml" xmlns:w16cex="http://schemas.microsoft.com/office/word/2018/wordml/cex" xmlns:w16cid="http://schemas.microsoft.com/office/word/2016/wordml/cid" xmlns:w16="http://schemas.microsoft.com/office/word/2018/wordml" xmlns:w16du="http://schemas.microsoft.com/office/word/2023/wordml/word16du" xmlns:w16sdtdh="http://schemas.microsoft.com/office/word/2020/wordml/sdtdatahash" xmlns:w16sdtfl="http://schemas.microsoft.com/office/word/2024/wordml/sdtformatlock" xmlns:w16se="http://schemas.microsoft.com/office/word/2015/wordml/symex" xmlns:wpg="http://schemas.microsoft.com/office/word/2010/wordprocessingGroup" xmlns:wpi="http://schemas.microsoft.com/office/word/2010/wordprocessingInk" xmlns:wne="http://schemas.microsoft.com/office/word/2006/wordml" xmlns:wps="http://schemas.microsoft.com/office/word/2010/wordprocessingShape" mc:Ignorable="w14 w15 w16se w16cid w16 w16cex w16sdtdh w16sdtfl w16du wp14">
   <w:body>
-    <w:p>
-      <w:r>
-        <w:t>ATILACAKLAR:</w:t>
-      </w:r>
-    </w:p>
-    <w:p>
-      <w:pPr>
-        <w:pStyle w:val="ListParagraph"/>
-        <w:numPr>
-          <w:ilvl w:val="0"/>
-          <w:numId w:val="5"/>
+    <w:p/>
+    <w:p>
+      <w:pPr>
+        <w:pStyle w:val="ListParagraph"/>
+        <w:numPr>
+          <w:ilvl w:val="0"/>
+          <w:numId w:val="8"/>
+        </w:numPr>
+      </w:pPr>
+      <w:r>
+        <w:t>cafeeehisarrr</w:t>
+      </w:r>
+    </w:p>
+    <w:p>
+      <w:pPr>
+        <w:pStyle w:val="ListParagraph"/>
+        <w:numPr>
+          <w:ilvl w:val="0"/>
+          <w:numId w:val="8"/>
+        </w:numPr>
+      </w:pPr>
+      <w:r>
+        <w:t>camlikgecedonercisi</w:t>
+      </w:r>
+    </w:p>
+    <w:p>
+      <w:pPr>
+        <w:pStyle w:val="ListParagraph"/>
+        <w:numPr>
+          <w:ilvl w:val="0"/>
+          <w:numId w:val="8"/>
+        </w:numPr>
+      </w:pPr>
+      <w:r>
+        <w:t>salosrestaurant</w:t>
+      </w:r>
+    </w:p>
+    <w:p>
+      <w:pPr>
+        <w:pStyle w:val="ListParagraph"/>
+        <w:numPr>
+          <w:ilvl w:val="0"/>
+          <w:numId w:val="8"/>
+        </w:numPr>
+      </w:pPr>
+      <w:r>
+        <w:t>sadecorba</w:t>
+      </w:r>
+    </w:p>
+    <w:p>
+      <w:pPr>
+        <w:pStyle w:val="ListParagraph"/>
+        <w:numPr>
+          <w:ilvl w:val="0"/>
+          <w:numId w:val="8"/>
+        </w:numPr>
+      </w:pPr>
+      <w:r>
+        <w:t>404kebap</w:t>
+      </w:r>
+    </w:p>
+    <w:p>
+      <w:pPr>
+        <w:pStyle w:val="ListParagraph"/>
+        <w:numPr>
+          <w:ilvl w:val="0"/>
+          <w:numId w:val="8"/>
+        </w:numPr>
+      </w:pPr>
+      <w:r>
+        <w:t>hr.doner</w:t>
+      </w:r>
+    </w:p>
+    <w:p>
+      <w:pPr>
+        <w:pStyle w:val="ListParagraph"/>
+        <w:numPr>
+          <w:ilvl w:val="0"/>
+          <w:numId w:val="8"/>
+        </w:numPr>
+      </w:pPr>
+      <w:r>
+        <w:t>hinacoffeebakery</w:t>
+      </w:r>
+    </w:p>
+    <w:p>
+      <w:pPr>
+        <w:pStyle w:val="ListParagraph"/>
+        <w:numPr>
+          <w:ilvl w:val="0"/>
+          <w:numId w:val="8"/>
+        </w:numPr>
+      </w:pPr>
+      <w:r>
+        <w:t>erganidallaschicken</w:t>
+      </w:r>
+    </w:p>
+    <w:p>
+      <w:pPr>
+        <w:pStyle w:val="ListParagraph"/>
+        <w:numPr>
+          <w:ilvl w:val="0"/>
+          <w:numId w:val="8"/>
+        </w:numPr>
+      </w:pPr>
+      <w:r>
+        <w:t>atmaca_durum</w:t>
+      </w:r>
+    </w:p>
+    <w:p>
+      <w:pPr>
+        <w:pStyle w:val="ListParagraph"/>
+        <w:numPr>
+          <w:ilvl w:val="0"/>
+          <w:numId w:val="8"/>
+        </w:numPr>
+      </w:pPr>
+      <w:r>
+        <w:t>sadecorba</w:t>
+      </w:r>
+    </w:p>
+    <w:p>
+      <w:pPr>
+        <w:pStyle w:val="ListParagraph"/>
+        <w:numPr>
+          <w:ilvl w:val="0"/>
+          <w:numId w:val="8"/>
+        </w:numPr>
+      </w:pPr>
+      <w:r>
+        <w:t>glo.chocolatetr</w:t>
+      </w:r>
+    </w:p>
+    <w:p>
+      <w:pPr>
+        <w:pStyle w:val="ListParagraph"/>
+        <w:numPr>
+          <w:ilvl w:val="0"/>
+          <w:numId w:val="8"/>
+        </w:numPr>
+      </w:pPr>
+      <w:r>
+        <w:t>urfalezzetsofrsi</w:t>
+      </w:r>
+    </w:p>
+    <w:p>
+      <w:pPr>
+        <w:pStyle w:val="ListParagraph"/>
+        <w:numPr>
+          <w:ilvl w:val="0"/>
+          <w:numId w:val="8"/>
+        </w:numPr>
+      </w:pPr>
+      <w:r>
+        <w:t>ersahdoner</w:t>
+      </w:r>
+    </w:p>
+    <w:p>
+      <w:pPr>
+        <w:pStyle w:val="ListParagraph"/>
+        <w:numPr>
+          <w:ilvl w:val="0"/>
+          <w:numId w:val="8"/>
+        </w:numPr>
+      </w:pPr>
+      <w:r>
+        <w:t>ustadankebap</w:t>
+      </w:r>
+    </w:p>
+    <w:p>
+      <w:pPr>
+        <w:pStyle w:val="ListParagraph"/>
+        <w:numPr>
+          <w:ilvl w:val="0"/>
+          <w:numId w:val="8"/>
+        </w:numPr>
+      </w:pPr>
+      <w:r>
+        <w:t>kadinlara_ozel_kafe</w:t>
+      </w:r>
+    </w:p>
+    <w:p>
+      <w:pPr>
+        <w:pStyle w:val="ListParagraph"/>
+        <w:numPr>
+          <w:ilvl w:val="0"/>
+          <w:numId w:val="8"/>
+        </w:numPr>
+      </w:pPr>
+      <w:r>
+        <w:t>gulhifadogalcafe</w:t>
+      </w:r>
+    </w:p>
+    <w:p>
+      <w:pPr>
+        <w:pStyle w:val="ListParagraph"/>
+        <w:numPr>
+          <w:ilvl w:val="0"/>
+          <w:numId w:val="8"/>
         </w:numPr>
       </w:pPr>
       <w:r>
@@ -24,19 +212,7 @@
         <w:pStyle w:val="ListParagraph"/>
         <w:numPr>
           <w:ilvl w:val="0"/>
-          <w:numId w:val="5"/>
-        </w:numPr>
-      </w:pPr>
-      <w:r>
-        <w:t>yemekustasi</w:t>
-      </w:r>
-    </w:p>
-    <w:p>
-      <w:pPr>
-        <w:pStyle w:val="ListParagraph"/>
-        <w:numPr>
-          <w:ilvl w:val="0"/>
-          <w:numId w:val="5"/>
+          <w:numId w:val="8"/>
         </w:numPr>
       </w:pPr>
       <w:r>
@@ -48,37 +224,319 @@
         <w:pStyle w:val="ListParagraph"/>
         <w:numPr>
           <w:ilvl w:val="0"/>
-          <w:numId w:val="5"/>
-        </w:numPr>
-      </w:pPr>
-      <w:r>
-        <w:t>sanpidelahmacun</w:t>
-      </w:r>
-    </w:p>
-    <w:p>
-      <w:pPr>
-        <w:pStyle w:val="ListParagraph"/>
-        <w:numPr>
-          <w:ilvl w:val="0"/>
-          <w:numId w:val="5"/>
+          <w:numId w:val="8"/>
         </w:numPr>
       </w:pPr>
       <w:r>
         <w:t>edremit_donergene</w:t>
       </w:r>
     </w:p>
-    <w:p/>
-    <w:p>
-      <w:r>
-        <w:t>ATILANLAR</w:t>
-      </w:r>
-    </w:p>
-    <w:p>
-      <w:pPr>
-        <w:pStyle w:val="ListParagraph"/>
-        <w:numPr>
-          <w:ilvl w:val="0"/>
-          <w:numId w:val="4"/>
+    <w:p>
+      <w:pPr>
+        <w:pStyle w:val="ListParagraph"/>
+        <w:numPr>
+          <w:ilvl w:val="0"/>
+          <w:numId w:val="8"/>
+        </w:numPr>
+      </w:pPr>
+      <w:r>
+        <w:t>dicheesefettuccine</w:t>
+      </w:r>
+    </w:p>
+    <w:p>
+      <w:pPr>
+        <w:pStyle w:val="ListParagraph"/>
+        <w:numPr>
+          <w:ilvl w:val="0"/>
+          <w:numId w:val="8"/>
+        </w:numPr>
+      </w:pPr>
+      <w:r>
+        <w:t>_sultancopsis</w:t>
+      </w:r>
+    </w:p>
+    <w:p>
+      <w:pPr>
+        <w:pStyle w:val="ListParagraph"/>
+        <w:numPr>
+          <w:ilvl w:val="0"/>
+          <w:numId w:val="8"/>
+        </w:numPr>
+      </w:pPr>
+      <w:r>
+        <w:t>maxdoydoner</w:t>
+      </w:r>
+    </w:p>
+    <w:p>
+      <w:pPr>
+        <w:pStyle w:val="ListParagraph"/>
+        <w:numPr>
+          <w:ilvl w:val="0"/>
+          <w:numId w:val="8"/>
+        </w:numPr>
+      </w:pPr>
+      <w:r>
+        <w:t>tasfirinatasehir</w:t>
+      </w:r>
+    </w:p>
+    <w:p>
+      <w:pPr>
+        <w:pStyle w:val="ListParagraph"/>
+        <w:numPr>
+          <w:ilvl w:val="0"/>
+          <w:numId w:val="8"/>
+        </w:numPr>
+      </w:pPr>
+      <w:r>
+        <w:t>cigercikadir.tr</w:t>
+      </w:r>
+    </w:p>
+    <w:p>
+      <w:pPr>
+        <w:pStyle w:val="ListParagraph"/>
+        <w:numPr>
+          <w:ilvl w:val="0"/>
+          <w:numId w:val="8"/>
+        </w:numPr>
+      </w:pPr>
+      <w:r>
+        <w:t>dedeogluveyselusta</w:t>
+      </w:r>
+    </w:p>
+    <w:p>
+      <w:pPr>
+        <w:pStyle w:val="ListParagraph"/>
+        <w:numPr>
+          <w:ilvl w:val="0"/>
+          <w:numId w:val="8"/>
+        </w:numPr>
+      </w:pPr>
+      <w:r>
+        <w:t>sirinbabadoner</w:t>
+      </w:r>
+    </w:p>
+    <w:p>
+      <w:pPr>
+        <w:pStyle w:val="ListParagraph"/>
+        <w:numPr>
+          <w:ilvl w:val="0"/>
+          <w:numId w:val="8"/>
+        </w:numPr>
+      </w:pPr>
+      <w:r>
+        <w:t>nizamustaaa</w:t>
+      </w:r>
+    </w:p>
+    <w:p>
+      <w:pPr>
+        <w:pStyle w:val="ListParagraph"/>
+        <w:numPr>
+          <w:ilvl w:val="0"/>
+          <w:numId w:val="8"/>
+        </w:numPr>
+      </w:pPr>
+      <w:r>
+        <w:t>mis_doner31</w:t>
+      </w:r>
+    </w:p>
+    <w:p>
+      <w:pPr>
+        <w:pStyle w:val="ListParagraph"/>
+        <w:numPr>
+          <w:ilvl w:val="0"/>
+          <w:numId w:val="8"/>
+        </w:numPr>
+      </w:pPr>
+      <w:r>
+        <w:t>09hataydoner</w:t>
+      </w:r>
+    </w:p>
+    <w:p>
+      <w:pPr>
+        <w:pStyle w:val="ListParagraph"/>
+        <w:numPr>
+          <w:ilvl w:val="0"/>
+          <w:numId w:val="8"/>
+        </w:numPr>
+      </w:pPr>
+      <w:r>
+        <w:t>mutlucankebap</w:t>
+      </w:r>
+    </w:p>
+    <w:p>
+      <w:pPr>
+        <w:pStyle w:val="ListParagraph"/>
+        <w:numPr>
+          <w:ilvl w:val="0"/>
+          <w:numId w:val="8"/>
+        </w:numPr>
+      </w:pPr>
+      <w:r>
+        <w:t>karadenizpidesalonu53</w:t>
+      </w:r>
+    </w:p>
+    <w:p>
+      <w:pPr>
+        <w:pStyle w:val="ListParagraph"/>
+        <w:numPr>
+          <w:ilvl w:val="0"/>
+          <w:numId w:val="8"/>
+        </w:numPr>
+      </w:pPr>
+      <w:r>
+        <w:t>elifipekdonmez</w:t>
+      </w:r>
+    </w:p>
+    <w:p>
+      <w:pPr>
+        <w:pStyle w:val="ListParagraph"/>
+        <w:numPr>
+          <w:ilvl w:val="0"/>
+          <w:numId w:val="8"/>
+        </w:numPr>
+      </w:pPr>
+      <w:r>
+        <w:t>aperative_mahsun</w:t>
+      </w:r>
+    </w:p>
+    <w:p>
+      <w:pPr>
+        <w:pStyle w:val="ListParagraph"/>
+        <w:numPr>
+          <w:ilvl w:val="0"/>
+          <w:numId w:val="8"/>
+        </w:numPr>
+      </w:pPr>
+      <w:r>
+        <w:t>springfieldbostanci</w:t>
+      </w:r>
+    </w:p>
+    <w:p>
+      <w:pPr>
+        <w:pStyle w:val="ListParagraph"/>
+        <w:numPr>
+          <w:ilvl w:val="0"/>
+          <w:numId w:val="8"/>
+        </w:numPr>
+      </w:pPr>
+      <w:r>
+        <w:t>kozbasidoner</w:t>
+      </w:r>
+    </w:p>
+    <w:p>
+      <w:pPr>
+        <w:pStyle w:val="ListParagraph"/>
+        <w:numPr>
+          <w:ilvl w:val="0"/>
+          <w:numId w:val="8"/>
+        </w:numPr>
+      </w:pPr>
+      <w:r>
+        <w:t>aylinliyy</w:t>
+      </w:r>
+    </w:p>
+    <w:p>
+      <w:pPr>
+        <w:pStyle w:val="ListParagraph"/>
+        <w:numPr>
+          <w:ilvl w:val="0"/>
+          <w:numId w:val="8"/>
+        </w:numPr>
+      </w:pPr>
+      <w:r>
+        <w:t>osmanliotagicafe</w:t>
+      </w:r>
+    </w:p>
+    <w:p>
+      <w:pPr>
+        <w:pStyle w:val="ListParagraph"/>
+        <w:numPr>
+          <w:ilvl w:val="0"/>
+          <w:numId w:val="8"/>
+        </w:numPr>
+      </w:pPr>
+      <w:r>
+        <w:t>7_24_altnozudoner</w:t>
+      </w:r>
+    </w:p>
+    <w:p>
+      <w:pPr>
+        <w:pStyle w:val="ListParagraph"/>
+        <w:numPr>
+          <w:ilvl w:val="0"/>
+          <w:numId w:val="8"/>
+        </w:numPr>
+      </w:pPr>
+      <w:r>
+        <w:t>tarihisurcigercisi</w:t>
+      </w:r>
+    </w:p>
+    <w:p>
+      <w:pPr>
+        <w:pStyle w:val="ListParagraph"/>
+        <w:numPr>
+          <w:ilvl w:val="0"/>
+          <w:numId w:val="8"/>
+        </w:numPr>
+      </w:pPr>
+      <w:r>
+        <w:t>sambayatetrestoran</w:t>
+      </w:r>
+    </w:p>
+    <w:p>
+      <w:pPr>
+        <w:pStyle w:val="ListParagraph"/>
+        <w:numPr>
+          <w:ilvl w:val="0"/>
+          <w:numId w:val="8"/>
+        </w:numPr>
+      </w:pPr>
+      <w:r>
+        <w:t>beykentdonerx</w:t>
+      </w:r>
+    </w:p>
+    <w:p>
+      <w:pPr>
+        <w:pStyle w:val="ListParagraph"/>
+        <w:numPr>
+          <w:ilvl w:val="0"/>
+          <w:numId w:val="8"/>
+        </w:numPr>
+      </w:pPr>
+      <w:r>
+        <w:t>ozkardeslertantunii</w:t>
+      </w:r>
+    </w:p>
+    <w:p>
+      <w:pPr>
+        <w:pStyle w:val="ListParagraph"/>
+        <w:numPr>
+          <w:ilvl w:val="0"/>
+          <w:numId w:val="8"/>
+        </w:numPr>
+      </w:pPr>
+      <w:r>
+        <w:t>narin.kebap</w:t>
+      </w:r>
+    </w:p>
+    <w:p>
+      <w:pPr>
+        <w:pStyle w:val="ListParagraph"/>
+        <w:numPr>
+          <w:ilvl w:val="0"/>
+          <w:numId w:val="8"/>
+        </w:numPr>
+      </w:pPr>
+      <w:r>
+        <w:t>narinkebap34</w:t>
+      </w:r>
+    </w:p>
+    <w:p>
+      <w:pPr>
+        <w:pStyle w:val="ListParagraph"/>
+        <w:numPr>
+          <w:ilvl w:val="0"/>
+          <w:numId w:val="8"/>
         </w:numPr>
       </w:pPr>
       <w:r>
@@ -90,7 +548,7 @@
         <w:pStyle w:val="ListParagraph"/>
         <w:numPr>
           <w:ilvl w:val="0"/>
-          <w:numId w:val="4"/>
+          <w:numId w:val="8"/>
         </w:numPr>
       </w:pPr>
       <w:r>
@@ -102,10 +560,11 @@
         <w:pStyle w:val="ListParagraph"/>
         <w:numPr>
           <w:ilvl w:val="0"/>
-          <w:numId w:val="4"/>
-        </w:numPr>
-      </w:pPr>
-      <w:r>
+          <w:numId w:val="8"/>
+        </w:numPr>
+      </w:pPr>
+      <w:r>
+        <w:lastRenderedPageBreak/>
         <w:t>usul.adana</w:t>
       </w:r>
     </w:p>
@@ -114,7 +573,7 @@
         <w:pStyle w:val="ListParagraph"/>
         <w:numPr>
           <w:ilvl w:val="0"/>
-          <w:numId w:val="4"/>
+          <w:numId w:val="8"/>
         </w:numPr>
       </w:pPr>
       <w:r>
@@ -126,7 +585,7 @@
         <w:pStyle w:val="ListParagraph"/>
         <w:numPr>
           <w:ilvl w:val="0"/>
-          <w:numId w:val="4"/>
+          <w:numId w:val="8"/>
         </w:numPr>
       </w:pPr>
       <w:r>
@@ -138,7 +597,7 @@
         <w:pStyle w:val="ListParagraph"/>
         <w:numPr>
           <w:ilvl w:val="0"/>
-          <w:numId w:val="4"/>
+          <w:numId w:val="8"/>
         </w:numPr>
       </w:pPr>
       <w:r>
@@ -150,7 +609,7 @@
         <w:pStyle w:val="ListParagraph"/>
         <w:numPr>
           <w:ilvl w:val="0"/>
-          <w:numId w:val="4"/>
+          <w:numId w:val="8"/>
         </w:numPr>
       </w:pPr>
       <w:r>
@@ -162,7 +621,7 @@
         <w:pStyle w:val="ListParagraph"/>
         <w:numPr>
           <w:ilvl w:val="0"/>
-          <w:numId w:val="4"/>
+          <w:numId w:val="8"/>
         </w:numPr>
       </w:pPr>
       <w:r>
@@ -174,7 +633,7 @@
         <w:pStyle w:val="ListParagraph"/>
         <w:numPr>
           <w:ilvl w:val="0"/>
-          <w:numId w:val="4"/>
+          <w:numId w:val="8"/>
         </w:numPr>
       </w:pPr>
       <w:r>
@@ -186,7 +645,7 @@
         <w:pStyle w:val="ListParagraph"/>
         <w:numPr>
           <w:ilvl w:val="0"/>
-          <w:numId w:val="4"/>
+          <w:numId w:val="8"/>
         </w:numPr>
       </w:pPr>
       <w:r>
@@ -198,7 +657,7 @@
         <w:pStyle w:val="ListParagraph"/>
         <w:numPr>
           <w:ilvl w:val="0"/>
-          <w:numId w:val="4"/>
+          <w:numId w:val="8"/>
         </w:numPr>
       </w:pPr>
       <w:r>
@@ -210,7 +669,7 @@
         <w:pStyle w:val="ListParagraph"/>
         <w:numPr>
           <w:ilvl w:val="0"/>
-          <w:numId w:val="4"/>
+          <w:numId w:val="8"/>
         </w:numPr>
       </w:pPr>
       <w:r>
@@ -222,7 +681,7 @@
         <w:pStyle w:val="ListParagraph"/>
         <w:numPr>
           <w:ilvl w:val="0"/>
-          <w:numId w:val="4"/>
+          <w:numId w:val="8"/>
         </w:numPr>
       </w:pPr>
       <w:r>
@@ -234,7 +693,7 @@
         <w:pStyle w:val="ListParagraph"/>
         <w:numPr>
           <w:ilvl w:val="0"/>
-          <w:numId w:val="4"/>
+          <w:numId w:val="8"/>
         </w:numPr>
       </w:pPr>
       <w:r>
@@ -246,7 +705,7 @@
         <w:pStyle w:val="ListParagraph"/>
         <w:numPr>
           <w:ilvl w:val="0"/>
-          <w:numId w:val="4"/>
+          <w:numId w:val="8"/>
         </w:numPr>
       </w:pPr>
       <w:r>
@@ -258,7 +717,7 @@
         <w:pStyle w:val="ListParagraph"/>
         <w:numPr>
           <w:ilvl w:val="0"/>
-          <w:numId w:val="4"/>
+          <w:numId w:val="8"/>
         </w:numPr>
       </w:pPr>
       <w:r>
@@ -270,7 +729,7 @@
         <w:pStyle w:val="ListParagraph"/>
         <w:numPr>
           <w:ilvl w:val="0"/>
-          <w:numId w:val="4"/>
+          <w:numId w:val="8"/>
         </w:numPr>
       </w:pPr>
       <w:r>
@@ -282,7 +741,7 @@
         <w:pStyle w:val="ListParagraph"/>
         <w:numPr>
           <w:ilvl w:val="0"/>
-          <w:numId w:val="4"/>
+          <w:numId w:val="8"/>
         </w:numPr>
       </w:pPr>
       <w:r>
@@ -294,7 +753,7 @@
         <w:pStyle w:val="ListParagraph"/>
         <w:numPr>
           <w:ilvl w:val="0"/>
-          <w:numId w:val="4"/>
+          <w:numId w:val="8"/>
         </w:numPr>
       </w:pPr>
       <w:r>
@@ -306,7 +765,7 @@
         <w:pStyle w:val="ListParagraph"/>
         <w:numPr>
           <w:ilvl w:val="0"/>
-          <w:numId w:val="4"/>
+          <w:numId w:val="8"/>
         </w:numPr>
       </w:pPr>
       <w:r>
@@ -318,7 +777,7 @@
         <w:pStyle w:val="ListParagraph"/>
         <w:numPr>
           <w:ilvl w:val="0"/>
-          <w:numId w:val="4"/>
+          <w:numId w:val="8"/>
         </w:numPr>
       </w:pPr>
       <w:r>
@@ -330,7 +789,7 @@
         <w:pStyle w:val="ListParagraph"/>
         <w:numPr>
           <w:ilvl w:val="0"/>
-          <w:numId w:val="4"/>
+          <w:numId w:val="8"/>
         </w:numPr>
       </w:pPr>
       <w:r>
@@ -342,7 +801,7 @@
         <w:pStyle w:val="ListParagraph"/>
         <w:numPr>
           <w:ilvl w:val="0"/>
-          <w:numId w:val="4"/>
+          <w:numId w:val="8"/>
         </w:numPr>
       </w:pPr>
       <w:r>
@@ -354,7 +813,7 @@
         <w:pStyle w:val="ListParagraph"/>
         <w:numPr>
           <w:ilvl w:val="0"/>
-          <w:numId w:val="4"/>
+          <w:numId w:val="8"/>
         </w:numPr>
       </w:pPr>
       <w:r>
@@ -366,7 +825,7 @@
         <w:pStyle w:val="ListParagraph"/>
         <w:numPr>
           <w:ilvl w:val="0"/>
-          <w:numId w:val="4"/>
+          <w:numId w:val="8"/>
         </w:numPr>
       </w:pPr>
       <w:r>
@@ -378,7 +837,7 @@
         <w:pStyle w:val="ListParagraph"/>
         <w:numPr>
           <w:ilvl w:val="0"/>
-          <w:numId w:val="4"/>
+          <w:numId w:val="8"/>
         </w:numPr>
       </w:pPr>
       <w:r>
@@ -390,7 +849,7 @@
         <w:pStyle w:val="ListParagraph"/>
         <w:numPr>
           <w:ilvl w:val="0"/>
-          <w:numId w:val="4"/>
+          <w:numId w:val="8"/>
         </w:numPr>
       </w:pPr>
       <w:r>
@@ -402,7 +861,7 @@
         <w:pStyle w:val="ListParagraph"/>
         <w:numPr>
           <w:ilvl w:val="0"/>
-          <w:numId w:val="4"/>
+          <w:numId w:val="8"/>
         </w:numPr>
       </w:pPr>
       <w:r>
@@ -414,7 +873,7 @@
         <w:pStyle w:val="ListParagraph"/>
         <w:numPr>
           <w:ilvl w:val="0"/>
-          <w:numId w:val="4"/>
+          <w:numId w:val="8"/>
         </w:numPr>
       </w:pPr>
       <w:r>
@@ -426,7 +885,7 @@
         <w:pStyle w:val="ListParagraph"/>
         <w:numPr>
           <w:ilvl w:val="0"/>
-          <w:numId w:val="4"/>
+          <w:numId w:val="8"/>
         </w:numPr>
       </w:pPr>
       <w:r>
@@ -438,7 +897,7 @@
         <w:pStyle w:val="ListParagraph"/>
         <w:numPr>
           <w:ilvl w:val="0"/>
-          <w:numId w:val="4"/>
+          <w:numId w:val="8"/>
         </w:numPr>
       </w:pPr>
       <w:r>
@@ -450,7 +909,7 @@
         <w:pStyle w:val="ListParagraph"/>
         <w:numPr>
           <w:ilvl w:val="0"/>
-          <w:numId w:val="4"/>
+          <w:numId w:val="8"/>
         </w:numPr>
       </w:pPr>
       <w:r>
@@ -462,7 +921,7 @@
         <w:pStyle w:val="ListParagraph"/>
         <w:numPr>
           <w:ilvl w:val="0"/>
-          <w:numId w:val="4"/>
+          <w:numId w:val="8"/>
         </w:numPr>
       </w:pPr>
       <w:r>
@@ -474,7 +933,7 @@
         <w:pStyle w:val="ListParagraph"/>
         <w:numPr>
           <w:ilvl w:val="0"/>
-          <w:numId w:val="4"/>
+          <w:numId w:val="8"/>
         </w:numPr>
       </w:pPr>
       <w:r>
@@ -486,7 +945,7 @@
         <w:pStyle w:val="ListParagraph"/>
         <w:numPr>
           <w:ilvl w:val="0"/>
-          <w:numId w:val="4"/>
+          <w:numId w:val="8"/>
         </w:numPr>
       </w:pPr>
       <w:r>
@@ -498,7 +957,7 @@
         <w:pStyle w:val="ListParagraph"/>
         <w:numPr>
           <w:ilvl w:val="0"/>
-          <w:numId w:val="4"/>
+          <w:numId w:val="8"/>
         </w:numPr>
       </w:pPr>
       <w:r>
@@ -510,7 +969,7 @@
         <w:pStyle w:val="ListParagraph"/>
         <w:numPr>
           <w:ilvl w:val="0"/>
-          <w:numId w:val="4"/>
+          <w:numId w:val="8"/>
         </w:numPr>
       </w:pPr>
       <w:r>
@@ -522,7 +981,7 @@
         <w:pStyle w:val="ListParagraph"/>
         <w:numPr>
           <w:ilvl w:val="0"/>
-          <w:numId w:val="4"/>
+          <w:numId w:val="8"/>
         </w:numPr>
       </w:pPr>
       <w:r>
@@ -534,155 +993,155 @@
         <w:pStyle w:val="ListParagraph"/>
         <w:numPr>
           <w:ilvl w:val="0"/>
-          <w:numId w:val="4"/>
+          <w:numId w:val="8"/>
+        </w:numPr>
+      </w:pPr>
+      <w:r>
+        <w:t>gözde.pastanesii</w:t>
+      </w:r>
+    </w:p>
+    <w:p>
+      <w:pPr>
+        <w:pStyle w:val="ListParagraph"/>
+        <w:numPr>
+          <w:ilvl w:val="0"/>
+          <w:numId w:val="8"/>
+        </w:numPr>
+      </w:pPr>
+      <w:r>
+        <w:t>antakya_doner01</w:t>
+      </w:r>
+    </w:p>
+    <w:p>
+      <w:pPr>
+        <w:pStyle w:val="ListParagraph"/>
+        <w:numPr>
+          <w:ilvl w:val="0"/>
+          <w:numId w:val="8"/>
+        </w:numPr>
+      </w:pPr>
+      <w:r>
+        <w:t>chocoo.linee</w:t>
+      </w:r>
+    </w:p>
+    <w:p>
+      <w:pPr>
+        <w:pStyle w:val="ListParagraph"/>
+        <w:numPr>
+          <w:ilvl w:val="0"/>
+          <w:numId w:val="8"/>
+        </w:numPr>
+      </w:pPr>
+      <w:r>
+        <w:t>sazelim_cafe_restaurant</w:t>
+      </w:r>
+    </w:p>
+    <w:p>
+      <w:pPr>
+        <w:pStyle w:val="ListParagraph"/>
+        <w:numPr>
+          <w:ilvl w:val="0"/>
+          <w:numId w:val="8"/>
+        </w:numPr>
+      </w:pPr>
+      <w:r>
+        <w:t>ist.lahmacunve.kebap</w:t>
+      </w:r>
+    </w:p>
+    <w:p>
+      <w:pPr>
+        <w:pStyle w:val="ListParagraph"/>
+        <w:numPr>
+          <w:ilvl w:val="0"/>
+          <w:numId w:val="8"/>
+        </w:numPr>
+      </w:pPr>
+      <w:r>
+        <w:t>mackbearcerkezkoy</w:t>
+      </w:r>
+    </w:p>
+    <w:p>
+      <w:pPr>
+        <w:pStyle w:val="ListParagraph"/>
+        <w:numPr>
+          <w:ilvl w:val="0"/>
+          <w:numId w:val="8"/>
+        </w:numPr>
+      </w:pPr>
+      <w:r>
+        <w:t>heydonerbagcilar</w:t>
+      </w:r>
+    </w:p>
+    <w:p>
+      <w:pPr>
+        <w:pStyle w:val="ListParagraph"/>
+        <w:numPr>
+          <w:ilvl w:val="0"/>
+          <w:numId w:val="8"/>
+        </w:numPr>
+      </w:pPr>
+      <w:r>
+        <w:t>floryacaferestaurant</w:t>
+      </w:r>
+    </w:p>
+    <w:p>
+      <w:pPr>
+        <w:pStyle w:val="ListParagraph"/>
+        <w:numPr>
+          <w:ilvl w:val="0"/>
+          <w:numId w:val="8"/>
+        </w:numPr>
+      </w:pPr>
+      <w:r>
+        <w:t>gua.kameroglu</w:t>
+      </w:r>
+    </w:p>
+    <w:p>
+      <w:pPr>
+        <w:pStyle w:val="ListParagraph"/>
+        <w:numPr>
+          <w:ilvl w:val="0"/>
+          <w:numId w:val="8"/>
+        </w:numPr>
+      </w:pPr>
+      <w:r>
+        <w:t>bigcitirzagri</w:t>
+      </w:r>
+    </w:p>
+    <w:p>
+      <w:pPr>
+        <w:pStyle w:val="ListParagraph"/>
+        <w:numPr>
+          <w:ilvl w:val="0"/>
+          <w:numId w:val="8"/>
+        </w:numPr>
+      </w:pPr>
+      <w:r>
+        <w:t>maslakcafe04</w:t>
+      </w:r>
+    </w:p>
+    <w:p>
+      <w:pPr>
+        <w:pStyle w:val="ListParagraph"/>
+        <w:numPr>
+          <w:ilvl w:val="0"/>
+          <w:numId w:val="8"/>
+        </w:numPr>
+      </w:pPr>
+      <w:r>
+        <w:t>koftecimyusuf04</w:t>
+      </w:r>
+    </w:p>
+    <w:p>
+      <w:pPr>
+        <w:pStyle w:val="ListParagraph"/>
+        <w:numPr>
+          <w:ilvl w:val="0"/>
+          <w:numId w:val="8"/>
         </w:numPr>
       </w:pPr>
       <w:r>
         <w:lastRenderedPageBreak/>
-        <w:t>gözde.pastanesii</w:t>
-      </w:r>
-    </w:p>
-    <w:p>
-      <w:pPr>
-        <w:pStyle w:val="ListParagraph"/>
-        <w:numPr>
-          <w:ilvl w:val="0"/>
-          <w:numId w:val="4"/>
-        </w:numPr>
-      </w:pPr>
-      <w:r>
-        <w:t>antakya_doner01</w:t>
-      </w:r>
-    </w:p>
-    <w:p>
-      <w:pPr>
-        <w:pStyle w:val="ListParagraph"/>
-        <w:numPr>
-          <w:ilvl w:val="0"/>
-          <w:numId w:val="4"/>
-        </w:numPr>
-      </w:pPr>
-      <w:r>
-        <w:t>chocoo.linee</w:t>
-      </w:r>
-    </w:p>
-    <w:p>
-      <w:pPr>
-        <w:pStyle w:val="ListParagraph"/>
-        <w:numPr>
-          <w:ilvl w:val="0"/>
-          <w:numId w:val="4"/>
-        </w:numPr>
-      </w:pPr>
-      <w:r>
-        <w:t>sazelim_cafe_restaurant</w:t>
-      </w:r>
-    </w:p>
-    <w:p>
-      <w:pPr>
-        <w:pStyle w:val="ListParagraph"/>
-        <w:numPr>
-          <w:ilvl w:val="0"/>
-          <w:numId w:val="4"/>
-        </w:numPr>
-      </w:pPr>
-      <w:r>
-        <w:t>ist.lahmacunve.kebap</w:t>
-      </w:r>
-    </w:p>
-    <w:p>
-      <w:pPr>
-        <w:pStyle w:val="ListParagraph"/>
-        <w:numPr>
-          <w:ilvl w:val="0"/>
-          <w:numId w:val="4"/>
-        </w:numPr>
-      </w:pPr>
-      <w:r>
-        <w:t>mackbearcerkezkoy</w:t>
-      </w:r>
-    </w:p>
-    <w:p>
-      <w:pPr>
-        <w:pStyle w:val="ListParagraph"/>
-        <w:numPr>
-          <w:ilvl w:val="0"/>
-          <w:numId w:val="4"/>
-        </w:numPr>
-      </w:pPr>
-      <w:r>
-        <w:t>heydonerbagcilar</w:t>
-      </w:r>
-    </w:p>
-    <w:p>
-      <w:pPr>
-        <w:pStyle w:val="ListParagraph"/>
-        <w:numPr>
-          <w:ilvl w:val="0"/>
-          <w:numId w:val="4"/>
-        </w:numPr>
-      </w:pPr>
-      <w:r>
-        <w:t>floryacaferestaurant</w:t>
-      </w:r>
-    </w:p>
-    <w:p>
-      <w:pPr>
-        <w:pStyle w:val="ListParagraph"/>
-        <w:numPr>
-          <w:ilvl w:val="0"/>
-          <w:numId w:val="4"/>
-        </w:numPr>
-      </w:pPr>
-      <w:r>
-        <w:t>gua.kameroglu</w:t>
-      </w:r>
-    </w:p>
-    <w:p>
-      <w:pPr>
-        <w:pStyle w:val="ListParagraph"/>
-        <w:numPr>
-          <w:ilvl w:val="0"/>
-          <w:numId w:val="4"/>
-        </w:numPr>
-      </w:pPr>
-      <w:r>
-        <w:t>bigcitirzagri</w:t>
-      </w:r>
-    </w:p>
-    <w:p>
-      <w:pPr>
-        <w:pStyle w:val="ListParagraph"/>
-        <w:numPr>
-          <w:ilvl w:val="0"/>
-          <w:numId w:val="4"/>
-        </w:numPr>
-      </w:pPr>
-      <w:r>
-        <w:t>maslakcafe04</w:t>
-      </w:r>
-    </w:p>
-    <w:p>
-      <w:pPr>
-        <w:pStyle w:val="ListParagraph"/>
-        <w:numPr>
-          <w:ilvl w:val="0"/>
-          <w:numId w:val="4"/>
-        </w:numPr>
-      </w:pPr>
-      <w:r>
-        <w:t>koftecimyusuf04</w:t>
-      </w:r>
-    </w:p>
-    <w:p>
-      <w:pPr>
-        <w:pStyle w:val="ListParagraph"/>
-        <w:numPr>
-          <w:ilvl w:val="0"/>
-          <w:numId w:val="4"/>
-        </w:numPr>
-      </w:pPr>
-      <w:r>
         <w:t>babil_patisserie</w:t>
       </w:r>
     </w:p>
@@ -699,6 +1158,92 @@
 <file path=word/numbering.xml><?xml version="1.0" encoding="utf-8"?>
 <w:numbering xmlns:wpc="http://schemas.microsoft.com/office/word/2010/wordprocessingCanvas" xmlns:cx="http://schemas.microsoft.com/office/drawing/2014/chartex" xmlns:cx1="http://schemas.microsoft.com/office/drawing/2015/9/8/chartex" xmlns:cx2="http://schemas.microsoft.com/office/drawing/2015/10/21/chartex" xmlns:cx3="http://schemas.microsoft.com/office/drawing/2016/5/9/chartex" xmlns:cx4="http://schemas.microsoft.com/office/drawing/2016/5/10/chartex" xmlns:cx5="http://schemas.microsoft.com/office/drawing/2016/5/11/chartex" xmlns:cx6="http://schemas.microsoft.com/office/drawing/2016/5/12/chartex" xmlns:cx7="http://schemas.microsoft.com/office/drawing/2016/5/13/chartex" xmlns:cx8="http://schemas.microsoft.com/office/drawing/2016/5/14/chartex" xmlns:mc="http://schemas.openxmlformats.org/markup-compatibility/2006" xmlns:aink="http://schemas.microsoft.com/office/drawing/2016/ink" xmlns:am3d="http://schemas.microsoft.com/office/drawing/2017/model3d" xmlns:o="urn:schemas-microsoft-com:office:office" xmlns:oel="http://schemas.microsoft.com/office/2019/extlst" xmlns:r="http://schemas.openxmlformats.org/officeDocument/2006/relationships" xmlns:m="http://schemas.openxmlformats.org/officeDocument/2006/math" xmlns:v="urn:schemas-microsoft-com:vml" xmlns:wp14="http://schemas.microsoft.com/office/word/2010/wordprocessingDrawing" xmlns:wp="http://schemas.openxmlformats.org/drawingml/2006/wordprocessingDrawing" xmlns:w10="urn:schemas-microsoft-com:office:word" xmlns:w="http://schemas.openxmlformats.org/wordprocessingml/2006/main" xmlns:w14="http://schemas.microsoft.com/office/word/2010/wordml" xmlns:w15="http://schemas.microsoft.com/office/word/2012/wordml" xmlns:w16cex="http://schemas.microsoft.com/office/word/2018/wordml/cex" xmlns:w16cid="http://schemas.microsoft.com/office/word/2016/wordml/cid" xmlns:w16="http://schemas.microsoft.com/office/word/2018/wordml" xmlns:w16du="http://schemas.microsoft.com/office/word/2023/wordml/word16du" xmlns:w16sdtdh="http://schemas.microsoft.com/office/word/2020/wordml/sdtdatahash" xmlns:w16sdtfl="http://schemas.microsoft.com/office/word/2024/wordml/sdtformatlock" xmlns:w16se="http://schemas.microsoft.com/office/word/2015/wordml/symex" xmlns:wpg="http://schemas.microsoft.com/office/word/2010/wordprocessingGroup" xmlns:wpi="http://schemas.microsoft.com/office/word/2010/wordprocessingInk" xmlns:wne="http://schemas.microsoft.com/office/word/2006/wordml" xmlns:wps="http://schemas.microsoft.com/office/word/2010/wordprocessingShape" mc:Ignorable="w14 w15 w16se w16cid w16 w16cex w16sdtdh w16sdtfl w16du wp14">
   <w:abstractNum w:abstractNumId="0" w15:restartNumberingAfterBreak="0">
+    <w:nsid w:val="0754615F"/>
+    <w:multiLevelType w:val="hybridMultilevel"/>
+    <w:tmpl w:val="82242464"/>
+    <w:lvl w:ilvl="0" w:tplc="041F000F">
+      <w:start w:val="1"/>
+      <w:numFmt w:val="decimal"/>
+      <w:lvlText w:val="%1."/>
+      <w:lvlJc w:val="left"/>
+      <w:pPr>
+        <w:ind w:left="720" w:hanging="360"/>
+      </w:pPr>
+    </w:lvl>
+    <w:lvl w:ilvl="1" w:tplc="041F0019" w:tentative="1">
+      <w:start w:val="1"/>
+      <w:numFmt w:val="lowerLetter"/>
+      <w:lvlText w:val="%2."/>
+      <w:lvlJc w:val="left"/>
+      <w:pPr>
+        <w:ind w:left="1440" w:hanging="360"/>
+      </w:pPr>
+    </w:lvl>
+    <w:lvl w:ilvl="2" w:tplc="041F001B" w:tentative="1">
+      <w:start w:val="1"/>
+      <w:numFmt w:val="lowerRoman"/>
+      <w:lvlText w:val="%3."/>
+      <w:lvlJc w:val="right"/>
+      <w:pPr>
+        <w:ind w:left="2160" w:hanging="180"/>
+      </w:pPr>
+    </w:lvl>
+    <w:lvl w:ilvl="3" w:tplc="041F000F" w:tentative="1">
+      <w:start w:val="1"/>
+      <w:numFmt w:val="decimal"/>
+      <w:lvlText w:val="%4."/>
+      <w:lvlJc w:val="left"/>
+      <w:pPr>
+        <w:ind w:left="2880" w:hanging="360"/>
+      </w:pPr>
+    </w:lvl>
+    <w:lvl w:ilvl="4" w:tplc="041F0019" w:tentative="1">
+      <w:start w:val="1"/>
+      <w:numFmt w:val="lowerLetter"/>
+      <w:lvlText w:val="%5."/>
+      <w:lvlJc w:val="left"/>
+      <w:pPr>
+        <w:ind w:left="3600" w:hanging="360"/>
+      </w:pPr>
+    </w:lvl>
+    <w:lvl w:ilvl="5" w:tplc="041F001B" w:tentative="1">
+      <w:start w:val="1"/>
+      <w:numFmt w:val="lowerRoman"/>
+      <w:lvlText w:val="%6."/>
+      <w:lvlJc w:val="right"/>
+      <w:pPr>
+        <w:ind w:left="4320" w:hanging="180"/>
+      </w:pPr>
+    </w:lvl>
+    <w:lvl w:ilvl="6" w:tplc="041F000F" w:tentative="1">
+      <w:start w:val="1"/>
+      <w:numFmt w:val="decimal"/>
+      <w:lvlText w:val="%7."/>
+      <w:lvlJc w:val="left"/>
+      <w:pPr>
+        <w:ind w:left="5040" w:hanging="360"/>
+      </w:pPr>
+    </w:lvl>
+    <w:lvl w:ilvl="7" w:tplc="041F0019" w:tentative="1">
+      <w:start w:val="1"/>
+      <w:numFmt w:val="lowerLetter"/>
+      <w:lvlText w:val="%8."/>
+      <w:lvlJc w:val="left"/>
+      <w:pPr>
+        <w:ind w:left="5760" w:hanging="360"/>
+      </w:pPr>
+    </w:lvl>
+    <w:lvl w:ilvl="8" w:tplc="041F001B" w:tentative="1">
+      <w:start w:val="1"/>
+      <w:numFmt w:val="lowerRoman"/>
+      <w:lvlText w:val="%9."/>
+      <w:lvlJc w:val="right"/>
+      <w:pPr>
+        <w:ind w:left="6480" w:hanging="180"/>
+      </w:pPr>
+    </w:lvl>
+  </w:abstractNum>
+  <w:abstractNum w:abstractNumId="1" w15:restartNumberingAfterBreak="0">
     <w:nsid w:val="0FF73840"/>
     <w:multiLevelType w:val="hybridMultilevel"/>
     <w:tmpl w:val="4D9A7AF2"/>
@@ -784,7 +1329,7 @@
       </w:pPr>
     </w:lvl>
   </w:abstractNum>
-  <w:abstractNum w:abstractNumId="1" w15:restartNumberingAfterBreak="0">
+  <w:abstractNum w:abstractNumId="2" w15:restartNumberingAfterBreak="0">
     <w:nsid w:val="12BF514F"/>
     <w:multiLevelType w:val="hybridMultilevel"/>
     <w:tmpl w:val="F68AC2BC"/>
@@ -870,7 +1415,93 @@
       </w:pPr>
     </w:lvl>
   </w:abstractNum>
-  <w:abstractNum w:abstractNumId="2" w15:restartNumberingAfterBreak="0">
+  <w:abstractNum w:abstractNumId="3" w15:restartNumberingAfterBreak="0">
+    <w:nsid w:val="3F026F70"/>
+    <w:multiLevelType w:val="hybridMultilevel"/>
+    <w:tmpl w:val="F1AE39E0"/>
+    <w:lvl w:ilvl="0" w:tplc="041F000F">
+      <w:start w:val="1"/>
+      <w:numFmt w:val="decimal"/>
+      <w:lvlText w:val="%1."/>
+      <w:lvlJc w:val="left"/>
+      <w:pPr>
+        <w:ind w:left="720" w:hanging="360"/>
+      </w:pPr>
+    </w:lvl>
+    <w:lvl w:ilvl="1" w:tplc="041F0019" w:tentative="1">
+      <w:start w:val="1"/>
+      <w:numFmt w:val="lowerLetter"/>
+      <w:lvlText w:val="%2."/>
+      <w:lvlJc w:val="left"/>
+      <w:pPr>
+        <w:ind w:left="1440" w:hanging="360"/>
+      </w:pPr>
+    </w:lvl>
+    <w:lvl w:ilvl="2" w:tplc="041F001B" w:tentative="1">
+      <w:start w:val="1"/>
+      <w:numFmt w:val="lowerRoman"/>
+      <w:lvlText w:val="%3."/>
+      <w:lvlJc w:val="right"/>
+      <w:pPr>
+        <w:ind w:left="2160" w:hanging="180"/>
+      </w:pPr>
+    </w:lvl>
+    <w:lvl w:ilvl="3" w:tplc="041F000F" w:tentative="1">
+      <w:start w:val="1"/>
+      <w:numFmt w:val="decimal"/>
+      <w:lvlText w:val="%4."/>
+      <w:lvlJc w:val="left"/>
+      <w:pPr>
+        <w:ind w:left="2880" w:hanging="360"/>
+      </w:pPr>
+    </w:lvl>
+    <w:lvl w:ilvl="4" w:tplc="041F0019" w:tentative="1">
+      <w:start w:val="1"/>
+      <w:numFmt w:val="lowerLetter"/>
+      <w:lvlText w:val="%5."/>
+      <w:lvlJc w:val="left"/>
+      <w:pPr>
+        <w:ind w:left="3600" w:hanging="360"/>
+      </w:pPr>
+    </w:lvl>
+    <w:lvl w:ilvl="5" w:tplc="041F001B" w:tentative="1">
+      <w:start w:val="1"/>
+      <w:numFmt w:val="lowerRoman"/>
+      <w:lvlText w:val="%6."/>
+      <w:lvlJc w:val="right"/>
+      <w:pPr>
+        <w:ind w:left="4320" w:hanging="180"/>
+      </w:pPr>
+    </w:lvl>
+    <w:lvl w:ilvl="6" w:tplc="041F000F" w:tentative="1">
+      <w:start w:val="1"/>
+      <w:numFmt w:val="decimal"/>
+      <w:lvlText w:val="%7."/>
+      <w:lvlJc w:val="left"/>
+      <w:pPr>
+        <w:ind w:left="5040" w:hanging="360"/>
+      </w:pPr>
+    </w:lvl>
+    <w:lvl w:ilvl="7" w:tplc="041F0019" w:tentative="1">
+      <w:start w:val="1"/>
+      <w:numFmt w:val="lowerLetter"/>
+      <w:lvlText w:val="%8."/>
+      <w:lvlJc w:val="left"/>
+      <w:pPr>
+        <w:ind w:left="5760" w:hanging="360"/>
+      </w:pPr>
+    </w:lvl>
+    <w:lvl w:ilvl="8" w:tplc="041F001B" w:tentative="1">
+      <w:start w:val="1"/>
+      <w:numFmt w:val="lowerRoman"/>
+      <w:lvlText w:val="%9."/>
+      <w:lvlJc w:val="right"/>
+      <w:pPr>
+        <w:ind w:left="6480" w:hanging="180"/>
+      </w:pPr>
+    </w:lvl>
+  </w:abstractNum>
+  <w:abstractNum w:abstractNumId="4" w15:restartNumberingAfterBreak="0">
     <w:nsid w:val="4E6130AE"/>
     <w:multiLevelType w:val="hybridMultilevel"/>
     <w:tmpl w:val="68FE4646"/>
@@ -956,7 +1587,7 @@
       </w:pPr>
     </w:lvl>
   </w:abstractNum>
-  <w:abstractNum w:abstractNumId="3" w15:restartNumberingAfterBreak="0">
+  <w:abstractNum w:abstractNumId="5" w15:restartNumberingAfterBreak="0">
     <w:nsid w:val="54C8366F"/>
     <w:multiLevelType w:val="hybridMultilevel"/>
     <w:tmpl w:val="21D42062"/>
@@ -1042,7 +1673,7 @@
       </w:pPr>
     </w:lvl>
   </w:abstractNum>
-  <w:abstractNum w:abstractNumId="4" w15:restartNumberingAfterBreak="0">
+  <w:abstractNum w:abstractNumId="6" w15:restartNumberingAfterBreak="0">
     <w:nsid w:val="59735C83"/>
     <w:multiLevelType w:val="hybridMultilevel"/>
     <w:tmpl w:val="AFE09FEC"/>
@@ -1128,19 +1759,114 @@
       </w:pPr>
     </w:lvl>
   </w:abstractNum>
+  <w:abstractNum w:abstractNumId="7" w15:restartNumberingAfterBreak="0">
+    <w:nsid w:val="657343E6"/>
+    <w:multiLevelType w:val="hybridMultilevel"/>
+    <w:tmpl w:val="0204D2BC"/>
+    <w:lvl w:ilvl="0" w:tplc="041F000F">
+      <w:start w:val="1"/>
+      <w:numFmt w:val="decimal"/>
+      <w:lvlText w:val="%1."/>
+      <w:lvlJc w:val="left"/>
+      <w:pPr>
+        <w:ind w:left="720" w:hanging="360"/>
+      </w:pPr>
+    </w:lvl>
+    <w:lvl w:ilvl="1" w:tplc="041F0019" w:tentative="1">
+      <w:start w:val="1"/>
+      <w:numFmt w:val="lowerLetter"/>
+      <w:lvlText w:val="%2."/>
+      <w:lvlJc w:val="left"/>
+      <w:pPr>
+        <w:ind w:left="1440" w:hanging="360"/>
+      </w:pPr>
+    </w:lvl>
+    <w:lvl w:ilvl="2" w:tplc="041F001B" w:tentative="1">
+      <w:start w:val="1"/>
+      <w:numFmt w:val="lowerRoman"/>
+      <w:lvlText w:val="%3."/>
+      <w:lvlJc w:val="right"/>
+      <w:pPr>
+        <w:ind w:left="2160" w:hanging="180"/>
+      </w:pPr>
+    </w:lvl>
+    <w:lvl w:ilvl="3" w:tplc="041F000F" w:tentative="1">
+      <w:start w:val="1"/>
+      <w:numFmt w:val="decimal"/>
+      <w:lvlText w:val="%4."/>
+      <w:lvlJc w:val="left"/>
+      <w:pPr>
+        <w:ind w:left="2880" w:hanging="360"/>
+      </w:pPr>
+    </w:lvl>
+    <w:lvl w:ilvl="4" w:tplc="041F0019" w:tentative="1">
+      <w:start w:val="1"/>
+      <w:numFmt w:val="lowerLetter"/>
+      <w:lvlText w:val="%5."/>
+      <w:lvlJc w:val="left"/>
+      <w:pPr>
+        <w:ind w:left="3600" w:hanging="360"/>
+      </w:pPr>
+    </w:lvl>
+    <w:lvl w:ilvl="5" w:tplc="041F001B" w:tentative="1">
+      <w:start w:val="1"/>
+      <w:numFmt w:val="lowerRoman"/>
+      <w:lvlText w:val="%6."/>
+      <w:lvlJc w:val="right"/>
+      <w:pPr>
+        <w:ind w:left="4320" w:hanging="180"/>
+      </w:pPr>
+    </w:lvl>
+    <w:lvl w:ilvl="6" w:tplc="041F000F" w:tentative="1">
+      <w:start w:val="1"/>
+      <w:numFmt w:val="decimal"/>
+      <w:lvlText w:val="%7."/>
+      <w:lvlJc w:val="left"/>
+      <w:pPr>
+        <w:ind w:left="5040" w:hanging="360"/>
+      </w:pPr>
+    </w:lvl>
+    <w:lvl w:ilvl="7" w:tplc="041F0019" w:tentative="1">
+      <w:start w:val="1"/>
+      <w:numFmt w:val="lowerLetter"/>
+      <w:lvlText w:val="%8."/>
+      <w:lvlJc w:val="left"/>
+      <w:pPr>
+        <w:ind w:left="5760" w:hanging="360"/>
+      </w:pPr>
+    </w:lvl>
+    <w:lvl w:ilvl="8" w:tplc="041F001B" w:tentative="1">
+      <w:start w:val="1"/>
+      <w:numFmt w:val="lowerRoman"/>
+      <w:lvlText w:val="%9."/>
+      <w:lvlJc w:val="right"/>
+      <w:pPr>
+        <w:ind w:left="6480" w:hanging="180"/>
+      </w:pPr>
+    </w:lvl>
+  </w:abstractNum>
   <w:num w:numId="1" w16cid:durableId="563100584">
+    <w:abstractNumId w:val="4"/>
+  </w:num>
+  <w:num w:numId="2" w16cid:durableId="1170027588">
+    <w:abstractNumId w:val="5"/>
+  </w:num>
+  <w:num w:numId="3" w16cid:durableId="210919692">
+    <w:abstractNumId w:val="6"/>
+  </w:num>
+  <w:num w:numId="4" w16cid:durableId="194582526">
     <w:abstractNumId w:val="2"/>
   </w:num>
-  <w:num w:numId="2" w16cid:durableId="1170027588">
+  <w:num w:numId="5" w16cid:durableId="1088188280">
+    <w:abstractNumId w:val="1"/>
+  </w:num>
+  <w:num w:numId="6" w16cid:durableId="1742676268">
     <w:abstractNumId w:val="3"/>
   </w:num>
-  <w:num w:numId="3" w16cid:durableId="210919692">
-    <w:abstractNumId w:val="4"/>
+  <w:num w:numId="7" w16cid:durableId="563684149">
+    <w:abstractNumId w:val="7"/>
   </w:num>
-  <w:num w:numId="4" w16cid:durableId="194582526">
-    <w:abstractNumId w:val="1"/>
-  </w:num>
-  <w:num w:numId="5" w16cid:durableId="1088188280">
+  <w:num w:numId="8" w16cid:durableId="1381633621">
     <w:abstractNumId w:val="0"/>
   </w:num>
 </w:numbering>

</xml_diff>